<commit_message>
Refine extension workflows and client telephony config
</commit_message>
<xml_diff>
--- a/docs/Client_Adaptation_Guide.docx
+++ b/docs/Client_Adaptation_Guide.docx
@@ -778,9 +778,11 @@
         <w:br/>
         <w:t xml:space="preserve">        "sip_check_enabled": true,</w:t>
         <w:br/>
+        <w:t xml:space="preserve">        "pjsip_supported": true,</w:t>
+        <w:br/>
+        <w:t xml:space="preserve">        "webrtc_supported": false,</w:t>
+        <w:br/>
         <w:t xml:space="preserve">        "company_name": "exact-company-name",</w:t>
-        <w:br/>
-        <w:t xml:space="preserve">        "extension_type": "pjsip"</w:t>
         <w:br/>
         <w:t xml:space="preserve">      },</w:t>
         <w:br/>
@@ -812,6 +814,33 @@
     <w:p>
       <w:r>
         <w:t>Keep safe defaults in the tracked example file. Store local environment values in the ignored local configuration or environment variables.</w:t>
+      </w:r>
+    </w:p>
+    <w:p>
+      <w:r>
+        <w:t xml:space="preserve">Do not configure one global extension type. Each workflow supplies its own type explicitly: </w:t>
+      </w:r>
+      <w:r>
+        <w:rPr>
+          <w:rFonts w:ascii="Cascadia Mono" w:hAnsi="Cascadia Mono"/>
+          <w:color w:val="17324D"/>
+          <w:sz w:val="18"/>
+        </w:rPr>
+        <w:t>pjsip</w:t>
+      </w:r>
+      <w:r>
+        <w:t xml:space="preserve"> for PJSIP scenarios and </w:t>
+      </w:r>
+      <w:r>
+        <w:rPr>
+          <w:rFonts w:ascii="Cascadia Mono" w:hAnsi="Cascadia Mono"/>
+          <w:color w:val="17324D"/>
+          <w:sz w:val="18"/>
+        </w:rPr>
+        <w:t>webrtc</w:t>
+      </w:r>
+      <w:r>
+        <w:t xml:space="preserve"> for WebRTC scenarios.</w:t>
       </w:r>
     </w:p>
     <w:p>
@@ -1603,6 +1632,10 @@
         <w:t>@pytest.mark.integration</w:t>
         <w:br/>
         <w:t>@pytest.mark.cloud_related</w:t>
+        <w:br/>
+        <w:t>@pytest.mark.requires_pjsip</w:t>
+        <w:br/>
+        <w:t>@pytest.mark.requires_webrtc</w:t>
       </w:r>
     </w:p>
     <w:p>
@@ -1619,6 +1652,60 @@
       </w:r>
       <w:r>
         <w:t>: collect or run only when the selected profile enables cloud behavior.</w:t>
+      </w:r>
+    </w:p>
+    <w:p>
+      <w:pPr>
+        <w:pStyle w:val="ListBullet"/>
+      </w:pPr>
+      <w:r>
+        <w:rPr>
+          <w:rFonts w:ascii="Cascadia Mono" w:hAnsi="Cascadia Mono"/>
+          <w:color w:val="17324D"/>
+          <w:sz w:val="18"/>
+        </w:rPr>
+        <w:t>requires_pjsip</w:t>
+      </w:r>
+      <w:r>
+        <w:t xml:space="preserve">: run only when the selected profile has </w:t>
+      </w:r>
+      <w:r>
+        <w:rPr>
+          <w:rFonts w:ascii="Cascadia Mono" w:hAnsi="Cascadia Mono"/>
+          <w:color w:val="17324D"/>
+          <w:sz w:val="18"/>
+        </w:rPr>
+        <w:t>pjsip_supported: true</w:t>
+      </w:r>
+      <w:r>
+        <w:t>.</w:t>
+      </w:r>
+    </w:p>
+    <w:p>
+      <w:pPr>
+        <w:pStyle w:val="ListBullet"/>
+      </w:pPr>
+      <w:r>
+        <w:rPr>
+          <w:rFonts w:ascii="Cascadia Mono" w:hAnsi="Cascadia Mono"/>
+          <w:color w:val="17324D"/>
+          <w:sz w:val="18"/>
+        </w:rPr>
+        <w:t>requires_webrtc</w:t>
+      </w:r>
+      <w:r>
+        <w:t xml:space="preserve">: run only when the selected profile has </w:t>
+      </w:r>
+      <w:r>
+        <w:rPr>
+          <w:rFonts w:ascii="Cascadia Mono" w:hAnsi="Cascadia Mono"/>
+          <w:color w:val="17324D"/>
+          <w:sz w:val="18"/>
+        </w:rPr>
+        <w:t>webrtc_supported: true</w:t>
+      </w:r>
+      <w:r>
+        <w:t>.</w:t>
       </w:r>
     </w:p>
     <w:p>

</xml_diff>